<commit_message>
renamed the py files
</commit_message>
<xml_diff>
--- a/docs/LLM_Monitoring_Platform_Technical_Report.docx
+++ b/docs/LLM_Monitoring_Platform_Technical_Report.docx
@@ -1,13 +1,12 @@
 
 <file path=word/document.xml><?xml version="1.0" encoding="utf-8"?>
-<w:document xmlns:wpc="http://schemas.microsoft.com/office/word/2010/wordprocessingCanvas" xmlns:cx="http://schemas.microsoft.com/office/drawing/2014/chartex" xmlns:cx1="http://schemas.microsoft.com/office/drawing/2015/9/8/chartex" xmlns:mc="http://schemas.openxmlformats.org/markup-compatibility/2006" xmlns:o="urn:schemas-microsoft-com:office:office" xmlns:r="http://schemas.openxmlformats.org/officeDocument/2006/relationships" xmlns:m="http://schemas.openxmlformats.org/officeDocument/2006/math" xmlns:v="urn:schemas-microsoft-com:vml" xmlns:wp14="http://schemas.microsoft.com/office/word/2010/wordprocessingDrawing" xmlns:wp="http://schemas.openxmlformats.org/drawingml/2006/wordprocessingDrawing" xmlns:w10="urn:schemas-microsoft-com:office:word" xmlns:w="http://schemas.openxmlformats.org/wordprocessingml/2006/main" xmlns:w14="http://schemas.microsoft.com/office/word/2010/wordml" xmlns:w15="http://schemas.microsoft.com/office/word/2012/wordml" xmlns:w16se="http://schemas.microsoft.com/office/word/2015/wordml/symex" xmlns:wpg="http://schemas.microsoft.com/office/word/2010/wordprocessingGroup" xmlns:wpi="http://schemas.microsoft.com/office/word/2010/wordprocessingInk" xmlns:wne="http://schemas.microsoft.com/office/word/2006/wordml" xmlns:wps="http://schemas.microsoft.com/office/word/2010/wordprocessingShape" mc:Ignorable="w14 w15 w16se wp14">
+<w:document xmlns:wpc="http://schemas.microsoft.com/office/word/2010/wordprocessingCanvas" xmlns:cx="http://schemas.microsoft.com/office/drawing/2014/chartex" xmlns:cx1="http://schemas.microsoft.com/office/drawing/2015/9/8/chartex" xmlns:cx2="http://schemas.microsoft.com/office/drawing/2015/10/21/chartex" xmlns:cx3="http://schemas.microsoft.com/office/drawing/2016/5/9/chartex" xmlns:cx4="http://schemas.microsoft.com/office/drawing/2016/5/10/chartex" xmlns:cx5="http://schemas.microsoft.com/office/drawing/2016/5/11/chartex" xmlns:cx6="http://schemas.microsoft.com/office/drawing/2016/5/12/chartex" xmlns:cx7="http://schemas.microsoft.com/office/drawing/2016/5/13/chartex" xmlns:cx8="http://schemas.microsoft.com/office/drawing/2016/5/14/chartex" xmlns:mc="http://schemas.openxmlformats.org/markup-compatibility/2006" xmlns:aink="http://schemas.microsoft.com/office/drawing/2016/ink" xmlns:am3d="http://schemas.microsoft.com/office/drawing/2017/model3d" xmlns:o="urn:schemas-microsoft-com:office:office" xmlns:oel="http://schemas.microsoft.com/office/2019/extlst" xmlns:r="http://schemas.openxmlformats.org/officeDocument/2006/relationships" xmlns:m="http://schemas.openxmlformats.org/officeDocument/2006/math" xmlns:v="urn:schemas-microsoft-com:vml" xmlns:wp14="http://schemas.microsoft.com/office/word/2010/wordprocessingDrawing" xmlns:wp="http://schemas.openxmlformats.org/drawingml/2006/wordprocessingDrawing" xmlns:w10="urn:schemas-microsoft-com:office:word" xmlns:w="http://schemas.openxmlformats.org/wordprocessingml/2006/main" xmlns:w14="http://schemas.microsoft.com/office/word/2010/wordml" xmlns:w15="http://schemas.microsoft.com/office/word/2012/wordml" xmlns:w16cex="http://schemas.microsoft.com/office/word/2018/wordml/cex" xmlns:w16cid="http://schemas.microsoft.com/office/word/2016/wordml/cid" xmlns:w16="http://schemas.microsoft.com/office/word/2018/wordml" xmlns:w16du="http://schemas.microsoft.com/office/word/2023/wordml/word16du" xmlns:w16sdtdh="http://schemas.microsoft.com/office/word/2020/wordml/sdtdatahash" xmlns:w16sdtfl="http://schemas.microsoft.com/office/word/2024/wordml/sdtformatlock" xmlns:w16se="http://schemas.microsoft.com/office/word/2015/wordml/symex" xmlns:wpg="http://schemas.microsoft.com/office/word/2010/wordprocessingGroup" xmlns:wpi="http://schemas.microsoft.com/office/word/2010/wordprocessingInk" xmlns:wne="http://schemas.microsoft.com/office/word/2006/wordml" xmlns:wps="http://schemas.microsoft.com/office/word/2010/wordprocessingShape" mc:Ignorable="w14 w15 w16se w16cid w16 w16cex w16sdtdh w16sdtfl w16du wp14">
   <w:body>
     <w:p>
       <w:pPr>
         <w:pStyle w:val="Title"/>
         <w:jc w:val="center"/>
       </w:pPr>
-      <w:bookmarkStart w:id="0" w:name="_GoBack"/>
       <w:r>
         <w:t>LLM Monitoring Platform</w:t>
       </w:r>
@@ -40,19 +39,12 @@
             </w:tcMar>
             <w:vAlign w:val="center"/>
           </w:tcPr>
-          <w:bookmarkEnd w:id="0"/>
           <w:p>
             <w:r>
               <w:rPr>
                 <w:b/>
               </w:rPr>
-              <w:t>R</w:t>
-            </w:r>
-            <w:r>
-              <w:rPr>
-                <w:b/>
-              </w:rPr>
-              <w:t>eport date</w:t>
+              <w:t>Report date</w:t>
             </w:r>
           </w:p>
         </w:tc>
@@ -181,25 +173,13 @@
     </w:p>
     <w:p>
       <w:r>
-        <w:t>The LLM Monitoring Platform is a</w:t>
-      </w:r>
-      <w:r>
-        <w:t xml:space="preserve"> local observability solution for a retrieval-augmented generation (RAG) application built with Azure OpenAI, FAISS, SQLite, </w:t>
+        <w:t xml:space="preserve">The LLM Monitoring Platform is a local observability solution for a retrieval-augmented generation (RAG) application built with Azure OpenAI, FAISS, SQLite, </w:t>
       </w:r>
       <w:r>
         <w:t xml:space="preserve">and </w:t>
       </w:r>
       <w:r>
-        <w:t>Streamlit</w:t>
-      </w:r>
-      <w:r>
-        <w:t>. It captures request-level telemetry, evaluates retrieval and response quality, detects embedding drift, compa</w:t>
-      </w:r>
-      <w:r>
-        <w:t>res prompt versions and presents operational findings through a six-tab dashboard. The implementation favors transparency and portability: all configuration is centralized, all request records are queryable, and generated reports remain available as JSON a</w:t>
-      </w:r>
-      <w:r>
-        <w:t>nd CSV artifacts.</w:t>
+        <w:t>Streamlit. It captures request-level telemetry, evaluates retrieval and response quality, detects embedding drift, compares prompt versions and presents operational findings through a six-tab dashboard. The implementation favors transparency and portability: all configuration is centralized, all request records are queryable, and generated reports remain available as JSON and CSV artifacts.</w:t>
       </w:r>
     </w:p>
     <w:p>
@@ -212,10 +192,7 @@
         <w:pStyle w:val="Heading1"/>
       </w:pPr>
       <w:r>
-        <w:t xml:space="preserve">1. </w:t>
-      </w:r>
-      <w:r>
-        <w:t>System Architecture</w:t>
+        <w:t>1. System Architecture</w:t>
       </w:r>
     </w:p>
     <w:tbl>
@@ -256,15 +233,7 @@
                 <w:color w:val="FFFFFF"/>
                 <w:sz w:val="16"/>
               </w:rPr>
-              <w:t xml:space="preserve">Input </w:t>
-            </w:r>
-            <w:r>
-              <w:rPr>
-                <w:b/>
-                <w:color w:val="FFFFFF"/>
-                <w:sz w:val="16"/>
-              </w:rPr>
-              <w:t>and Models</w:t>
+              <w:t>Input and Models</w:t>
             </w:r>
           </w:p>
         </w:tc>
@@ -476,13 +445,7 @@
               <w:rPr>
                 <w:sz w:val="16"/>
               </w:rPr>
-              <w:t>Streamlit d</w:t>
-            </w:r>
-            <w:r>
-              <w:rPr>
-                <w:sz w:val="16"/>
-              </w:rPr>
-              <w:t>ashboard</w:t>
+              <w:t>Streamlit dashboard</w:t>
             </w:r>
             <w:r>
               <w:rPr>
@@ -509,10 +472,7 @@
     </w:p>
     <w:p>
       <w:r>
-        <w:t xml:space="preserve">Documents are chunked into 800-character segments with 100-character overlap and embedded into a local FAISS index. For each user query, the RAG pipeline retrieves the top three chunks, constructs a </w:t>
-      </w:r>
-      <w:r>
-        <w:t>versioned prompt and calls the Azure-hosted chat model. The logger persists the complete transaction, after which offline analysis modules calculate cost, latency, quality, drift and a composite health score.</w:t>
+        <w:t>Documents are chunked into 800-character segments with 100-character overlap and embedded into a local FAISS index. For each user query, the RAG pipeline retrieves the top three chunks, constructs a versioned prompt and calls the Azure-hosted chat model. The logger persists the complete transaction, after which offline analysis modules calculate cost, latency, quality, drift and a composite health score.</w:t>
       </w:r>
     </w:p>
     <w:p>
@@ -530,10 +490,7 @@
         <w:ind w:hanging="259"/>
       </w:pPr>
       <w:r>
-        <w:t>Central configura</w:t>
-      </w:r>
-      <w:r>
-        <w:t>tion: model deployments, paths, pricing, thresholds and prompt versions are defined in src/config.py.</w:t>
+        <w:t>Central configuration: model deployments, paths, pricing, thresholds and prompt versions are defined in src/config.py.</w:t>
       </w:r>
     </w:p>
     <w:p>
@@ -553,10 +510,13 @@
         <w:ind w:hanging="259"/>
       </w:pPr>
       <w:r>
-        <w:t>Synchrono</w:t>
+        <w:t xml:space="preserve">Synchronous local execution: simple to inspect and </w:t>
       </w:r>
       <w:r>
-        <w:t>us local execution: simple to inspect and reproduce, but intended for single-user evaluation rather than high-throughput production serving.</w:t>
+        <w:t>reproduce but</w:t>
+      </w:r>
+      <w:r>
+        <w:t xml:space="preserve"> intended for single-user evaluation rather than high-throughput production serving.</w:t>
       </w:r>
     </w:p>
     <w:p>
@@ -575,10 +535,7 @@
     </w:p>
     <w:p>
       <w:r>
-        <w:t>LLMLogger is the observability boundary between the RAG pipeline and persistent storage. Ev</w:t>
-      </w:r>
-      <w:r>
-        <w:t>ery completed request is normalized into a consistent schema and written first to CSV, then to SQLite. Immediate CSV flushing preserves a readable audit record, while SQLite indexes support dashboard filters and aggregate analysis.</w:t>
+        <w:t>LLMLogger is the observability boundary between the RAG pipeline and persistent storage. Every completed request is normalized into a consistent schema and written first to CSV, then to SQLite. Immediate CSV flushing preserves a readable audit record, while SQLite indexes support dashboard filters and aggregate analysis.</w:t>
       </w:r>
     </w:p>
     <w:tbl>
@@ -889,13 +846,7 @@
               <w:rPr>
                 <w:sz w:val="16"/>
               </w:rPr>
-              <w:t xml:space="preserve">Evidence inspection and </w:t>
-            </w:r>
-            <w:r>
-              <w:rPr>
-                <w:sz w:val="16"/>
-              </w:rPr>
-              <w:t>retrieval debugging</w:t>
+              <w:t>Evidence inspection and retrieval debugging</w:t>
             </w:r>
           </w:p>
         </w:tc>
@@ -1233,10 +1184,7 @@
         <w:ind w:hanging="259"/>
       </w:pPr>
       <w:r>
-        <w:t>f_token_laten</w:t>
-      </w:r>
-      <w:r>
-        <w:t>cy_tracker.py calculates token totals, estimated cost, latency percentiles, slow requests and prompt-version comparisons.</w:t>
+        <w:t>f_token_latency_tracker.py calculates token totals, estimated cost, latency percentiles, slow requests and prompt-version comparisons.</w:t>
       </w:r>
     </w:p>
     <w:p>
@@ -1246,10 +1194,13 @@
         <w:ind w:hanging="259"/>
       </w:pPr>
       <w:r>
-        <w:t>g_rag_evaluator.py uses an LLM-as-judge process to score context relevance, faithfulness and groundedness, then stores results in rag_</w:t>
+        <w:t xml:space="preserve">g_rag_evaluator.py uses an LLM-as-judge process to score context relevance, faithfulness and groundedness, then </w:t>
       </w:r>
       <w:r>
-        <w:t>evaluations.</w:t>
+        <w:t>store</w:t>
+      </w:r>
+      <w:r>
+        <w:t xml:space="preserve"> results in rag_evaluations.</w:t>
       </w:r>
     </w:p>
     <w:p>
@@ -1269,10 +1220,7 @@
         <w:ind w:hanging="259"/>
       </w:pPr>
       <w:r>
-        <w:t xml:space="preserve">e_evaluation.py combines all monitoring dimensions into the final JSON report and weighted system-health </w:t>
-      </w:r>
-      <w:r>
-        <w:t>score.</w:t>
+        <w:t>e_evaluation.py combines all monitoring dimensions into the final JSON report and weighted system-health score.</w:t>
       </w:r>
     </w:p>
     <w:p>
@@ -1285,10 +1233,7 @@
     </w:p>
     <w:p>
       <w:r>
-        <w:t>The logger supplies defaults for missing values, serializes retrieved chunks as JSON and commits each SQLite insert. Safety screening is a case-insensitive keyword match against terms such as hack, weapon, bypass a</w:t>
-      </w:r>
-      <w:r>
-        <w:t>nd jailbreak. A match sets safety_flag to 1 but does not block the request; the mechanism is therefore observational rather than preventive. In the measured workload, 27 of 591 requests were flagged and no request errors were recorded.</w:t>
+        <w:t>The logger supplies defaults for missing values, serializes retrieved chunks as JSON and commits each SQLite insert. Safety screening is a case-insensitive keyword match against terms such as hack, weapon, bypass and jailbreak. A match sets safety_flag to 1 but does not block the request; the mechanism is therefore observational rather than preventive. In the measured workload, 27 of 591 requests were flagged and no request errors were recorded.</w:t>
       </w:r>
     </w:p>
     <w:p>
@@ -1307,10 +1252,7 @@
     </w:p>
     <w:p>
       <w:r>
-        <w:t>Metrics ar</w:t>
-      </w:r>
-      <w:r>
-        <w:t>e defined at request, evaluation-run and system levels. Thresholds are centralized in config.py so the same values can be used by analysis scripts and the dashboard.</w:t>
+        <w:t>Metrics are defined at request, evaluation-run and system levels. Thresholds are centralized in config.py so the same values can be used by analysis scripts and the dashboard.</w:t>
       </w:r>
     </w:p>
     <w:tbl>
@@ -1470,13 +1412,7 @@
               <w:rPr>
                 <w:sz w:val="16"/>
               </w:rPr>
-              <w:t xml:space="preserve">Per request </w:t>
-            </w:r>
-            <w:r>
-              <w:rPr>
-                <w:sz w:val="16"/>
-              </w:rPr>
-              <w:t>and aggregate</w:t>
+              <w:t>Per request and aggregate</w:t>
             </w:r>
           </w:p>
         </w:tc>
@@ -1680,13 +1616,7 @@
               <w:rPr>
                 <w:sz w:val="16"/>
               </w:rPr>
-              <w:t>Judge score from 0 to</w:t>
-            </w:r>
-            <w:r>
-              <w:rPr>
-                <w:sz w:val="16"/>
-              </w:rPr>
-              <w:t xml:space="preserve"> 1</w:t>
+              <w:t>Judge score from 0 to 1</w:t>
             </w:r>
           </w:p>
         </w:tc>
@@ -1912,13 +1842,19 @@
               <w:rPr>
                 <w:sz w:val="16"/>
               </w:rPr>
-              <w:t xml:space="preserve">1 - </w:t>
+              <w:t xml:space="preserve">1 - cosine </w:t>
             </w:r>
             <w:r>
               <w:rPr>
                 <w:sz w:val="16"/>
               </w:rPr>
-              <w:t>cosine similarity(current, baseline)</w:t>
+              <w:t>similarity (</w:t>
+            </w:r>
+            <w:r>
+              <w:rPr>
+                <w:sz w:val="16"/>
+              </w:rPr>
+              <w:t>current, baseline)</w:t>
             </w:r>
           </w:p>
         </w:tc>
@@ -2422,13 +2358,7 @@
               <w:rPr>
                 <w:sz w:val="16"/>
               </w:rPr>
-              <w:t xml:space="preserve">Primary quality weakness </w:t>
-            </w:r>
-            <w:r>
-              <w:rPr>
-                <w:sz w:val="16"/>
-              </w:rPr>
-              <w:t>in the consolidated run</w:t>
+              <w:t>Primary quality weakness in the consolidated run</w:t>
             </w:r>
           </w:p>
         </w:tc>
@@ -2653,13 +2583,7 @@
               <w:rPr>
                 <w:sz w:val="16"/>
               </w:rPr>
-              <w:t xml:space="preserve">20 anomalies across 60 measurements; later </w:t>
-            </w:r>
-            <w:r>
-              <w:rPr>
-                <w:sz w:val="16"/>
-              </w:rPr>
-              <w:t>individual run was healthy</w:t>
+              <w:t>20 anomalies across 60 measurements; later individual run was healthy</w:t>
             </w:r>
           </w:p>
         </w:tc>
@@ -2749,13 +2673,7 @@
     </w:p>
     <w:p>
       <w:r>
-        <w:t>The Azure chat call contributes approximately 79.6% of average end-to-end latency, while retrieval contributes 20.4%. Prompt version v2 w</w:t>
-      </w:r>
-      <w:r>
-        <w:t>as faster on average (2.084 s versus 2.310 s) and slightly cheaper per request, although it used about 15.8 more tokens per request. These results show why token, cost, latency and quality metrics should be reviewed together instead of optimized independen</w:t>
-      </w:r>
-      <w:r>
-        <w:t>tly.</w:t>
+        <w:t>The Azure chat call contributes approximately 79.6% of average end-to-end latency, while retrieval contributes 20.4%. Prompt version v2 was faster on average (2.084 s versus 2.310 s) and slightly cheaper per request, although it used about 15.8 more tokens per request. These results show why token, cost, latency and quality metrics should be reviewed together instead of optimized independently.</w:t>
       </w:r>
     </w:p>
     <w:p>
@@ -2774,10 +2692,7 @@
     </w:p>
     <w:p>
       <w:r>
-        <w:t xml:space="preserve">The Streamlit dashboard uses Plotly charts and a wide layout to support operational review. Data is read from SQLite and cached for 30 seconds, with a manual refresh control for immediate updates. The design separates high-level </w:t>
-      </w:r>
-      <w:r>
-        <w:t>status from detailed investigation so an operator can move from a KPI anomaly to the affected requests.</w:t>
+        <w:t>The Streamlit dashboard uses Plotly charts and a wide layout to support operational review. Data is read from SQLite and cached for 30 seconds, with a manual refresh control for immediate updates. The design separates high-level status from detailed investigation so an operator can move from a KPI anomaly to the affected requests.</w:t>
       </w:r>
     </w:p>
     <w:tbl>
@@ -2937,13 +2852,7 @@
               <w:rPr>
                 <w:sz w:val="16"/>
               </w:rPr>
-              <w:t>Rapid health a</w:t>
-            </w:r>
-            <w:r>
-              <w:rPr>
-                <w:sz w:val="16"/>
-              </w:rPr>
-              <w:t>ssessment</w:t>
+              <w:t>Rapid health assessment</w:t>
             </w:r>
           </w:p>
         </w:tc>
@@ -3298,13 +3207,7 @@
               <w:rPr>
                 <w:sz w:val="16"/>
               </w:rPr>
-              <w:t xml:space="preserve">Filters, keyword </w:t>
-            </w:r>
-            <w:r>
-              <w:rPr>
-                <w:sz w:val="16"/>
-              </w:rPr>
-              <w:t>search, pagination and full-response inspection</w:t>
+              <w:t>Filters, keyword search, pagination and full-response inspection</w:t>
             </w:r>
           </w:p>
         </w:tc>
@@ -3349,10 +3252,7 @@
     </w:p>
     <w:p>
       <w:r>
-        <w:t xml:space="preserve">Alerting is threshold-based and currently remains inside the application. Alerts are evaluated during request processing, analysis, or dashboard rendering. </w:t>
-      </w:r>
-      <w:r>
-        <w:t>The dashboard presents critical conditions in red, warnings in amber and healthy states in green; the same findings are retained in generated JSON reports for later review.</w:t>
+        <w:t>Alerting is threshold-based and currently remains inside the application. Alerts are evaluated during request processing, analysis, or dashboard rendering. The dashboard presents critical conditions in red, warnings in amber and healthy states in green; the same findings are retained in generated JSON reports for later review.</w:t>
       </w:r>
     </w:p>
     <w:tbl>
@@ -3740,13 +3640,7 @@
               <w:rPr>
                 <w:sz w:val="16"/>
               </w:rPr>
-              <w:t xml:space="preserve">Quality flags and low-score </w:t>
-            </w:r>
-            <w:r>
-              <w:rPr>
-                <w:sz w:val="16"/>
-              </w:rPr>
-              <w:t>tables</w:t>
+              <w:t>Quality flags and low-score tables</w:t>
             </w:r>
           </w:p>
         </w:tc>
@@ -3923,10 +3817,7 @@
         <w:ind w:hanging="259"/>
       </w:pPr>
       <w:r>
-        <w:t xml:space="preserve">Detect: request middleware and analysis scripts calculate </w:t>
-      </w:r>
-      <w:r>
-        <w:t>flags from centralized thresholds.</w:t>
+        <w:t>Detect: request middleware and analysis scripts calculate flags from centralized thresholds.</w:t>
       </w:r>
     </w:p>
     <w:p>
@@ -3956,10 +3847,7 @@
         <w:ind w:hanging="259"/>
       </w:pPr>
       <w:r>
-        <w:t>Investigate: operators use dashboar</w:t>
-      </w:r>
-      <w:r>
-        <w:t>d filters and the full-response viewer to identify the affected query, model, prompt version and evidence.</w:t>
+        <w:t>Investigate: operators use dashboard filters and the full-response viewer to identify the affected query, model, prompt version and evidence.</w:t>
       </w:r>
     </w:p>
     <w:p>
@@ -4094,13 +3982,7 @@
               <w:rPr>
                 <w:sz w:val="16"/>
               </w:rPr>
-              <w:t xml:space="preserve">Historical anomalies appear to reflect an embedding deployment or baseline change. The current detector cannot distinguish provider </w:t>
-            </w:r>
-            <w:r>
-              <w:rPr>
-                <w:sz w:val="16"/>
-              </w:rPr>
-              <w:t>model-version changes from true semantic drift.</w:t>
+              <w:t>Historical anomalies appear to reflect an embedding deployment or baseline change. The current detector cannot distinguish provider model-version changes from true semantic drift.</w:t>
             </w:r>
           </w:p>
         </w:tc>
@@ -4204,13 +4086,7 @@
               <w:rPr>
                 <w:sz w:val="16"/>
               </w:rPr>
-              <w:t xml:space="preserve">Quality evaluation </w:t>
-            </w:r>
-            <w:r>
-              <w:rPr>
-                <w:sz w:val="16"/>
-              </w:rPr>
-              <w:t>requires three model calls per response and is sample-limited, which introduces cost, latency and possible sampling bias.</w:t>
+              <w:t>Quality evaluation requires three model calls per response and is sample-limited, which introduces cost, latency and possible sampling bias.</w:t>
             </w:r>
           </w:p>
         </w:tc>
@@ -4263,13 +4139,7 @@
               <w:rPr>
                 <w:sz w:val="16"/>
               </w:rPr>
-              <w:t>Substring matching misses semantically harmful prompts, obfuscated instructions and many forms of prompt injectio</w:t>
-            </w:r>
-            <w:r>
-              <w:rPr>
-                <w:sz w:val="16"/>
-              </w:rPr>
-              <w:t>n.</w:t>
+              <w:t>Substring matching misses semantically harmful prompts, obfuscated instructions and many forms of prompt injection.</w:t>
             </w:r>
           </w:p>
         </w:tc>
@@ -4373,13 +4243,7 @@
               <w:rPr>
                 <w:sz w:val="16"/>
               </w:rPr>
-              <w:t>The repository has no automated test suite, model registry, prompt approv</w:t>
-            </w:r>
-            <w:r>
-              <w:rPr>
-                <w:sz w:val="16"/>
-              </w:rPr>
-              <w:t>al workflow or formal retention policy.</w:t>
+              <w:t>The repository has no automated test suite, model registry, prompt approval workflow or formal retention policy.</w:t>
             </w:r>
           </w:p>
         </w:tc>
@@ -4537,13 +4401,7 @@
               <w:rPr>
                 <w:sz w:val="16"/>
               </w:rPr>
-              <w:t xml:space="preserve">2. </w:t>
-            </w:r>
-            <w:r>
-              <w:rPr>
-                <w:sz w:val="16"/>
-              </w:rPr>
-              <w:t>Automate alerts</w:t>
+              <w:t>2. Automate alerts</w:t>
             </w:r>
           </w:p>
         </w:tc>
@@ -4618,13 +4476,7 @@
               <w:rPr>
                 <w:sz w:val="16"/>
               </w:rPr>
-              <w:t>Use risk-based sampling, deterministic evaluation datasets and periodic human calibration of LLM-judge</w:t>
-            </w:r>
-            <w:r>
-              <w:rPr>
-                <w:sz w:val="16"/>
-              </w:rPr>
-              <w:t xml:space="preserve"> scores.</w:t>
+              <w:t>Use risk-based sampling, deterministic evaluation datasets and periodic human calibration of LLM-judge scores.</w:t>
             </w:r>
           </w:p>
         </w:tc>
@@ -4728,13 +4580,7 @@
               <w:rPr>
                 <w:sz w:val="16"/>
               </w:rPr>
-              <w:t>Move operational logs to PostgreSQL and use a managed vector store where concurrency, backups an</w:t>
-            </w:r>
-            <w:r>
-              <w:rPr>
-                <w:sz w:val="16"/>
-              </w:rPr>
-              <w:t>d access controls are required.</w:t>
+              <w:t>Move operational logs to PostgreSQL and use a managed vector store where concurrency, backups and access controls are required.</w:t>
             </w:r>
           </w:p>
         </w:tc>
@@ -4808,16 +4654,7 @@
     </w:p>
     <w:p>
       <w:r>
-        <w:t xml:space="preserve">The platform provides a well-scoped </w:t>
-      </w:r>
-      <w:r>
-        <w:t>monitoring foundation for a local RAG application. Its strongest features are complete request telemetry, transparent metric calculations, quality and drift evaluation, and an investigation-oriented dashboard. The measured system is reliable and reasonably</w:t>
-      </w:r>
-      <w:r>
-        <w:t xml:space="preserve"> fast, but the consolidated health score demonstrates that observability is only useful when baselines and alert delivery are trustworthy. Versioned drift baselines, continuous analysis, external notifications and automated tests are the highest-value next</w:t>
-      </w:r>
-      <w:r>
-        <w:t xml:space="preserve"> steps toward production readiness.</w:t>
+        <w:t>The platform provides a well-scoped monitoring foundation for a local RAG application. Its strongest features are complete request telemetry, transparent metric calculations, quality and drift evaluation, and an investigation-oriented dashboard. The measured system is reliable and reasonably fast, but the consolidated health score demonstrates that observability is only useful when baselines and alert delivery are trustworthy. Versioned drift baselines, continuous analysis, external notifications and automated tests are the highest-value next steps toward production readiness.</w:t>
       </w:r>
     </w:p>
     <w:sectPr>
@@ -4832,7 +4669,7 @@
 </file>
 
 <file path=word/endnotes.xml><?xml version="1.0" encoding="utf-8"?>
-<w:endnotes xmlns:wpc="http://schemas.microsoft.com/office/word/2010/wordprocessingCanvas" xmlns:cx="http://schemas.microsoft.com/office/drawing/2014/chartex" xmlns:cx1="http://schemas.microsoft.com/office/drawing/2015/9/8/chartex" xmlns:mc="http://schemas.openxmlformats.org/markup-compatibility/2006" xmlns:o="urn:schemas-microsoft-com:office:office" xmlns:r="http://schemas.openxmlformats.org/officeDocument/2006/relationships" xmlns:m="http://schemas.openxmlformats.org/officeDocument/2006/math" xmlns:v="urn:schemas-microsoft-com:vml" xmlns:wp14="http://schemas.microsoft.com/office/word/2010/wordprocessingDrawing" xmlns:wp="http://schemas.openxmlformats.org/drawingml/2006/wordprocessingDrawing" xmlns:w10="urn:schemas-microsoft-com:office:word" xmlns:w="http://schemas.openxmlformats.org/wordprocessingml/2006/main" xmlns:w14="http://schemas.microsoft.com/office/word/2010/wordml" xmlns:w15="http://schemas.microsoft.com/office/word/2012/wordml" xmlns:w16se="http://schemas.microsoft.com/office/word/2015/wordml/symex" xmlns:wpg="http://schemas.microsoft.com/office/word/2010/wordprocessingGroup" xmlns:wpi="http://schemas.microsoft.com/office/word/2010/wordprocessingInk" xmlns:wne="http://schemas.microsoft.com/office/word/2006/wordml" xmlns:wps="http://schemas.microsoft.com/office/word/2010/wordprocessingShape" mc:Ignorable="w14 w15 w16se wp14">
+<w:endnotes xmlns:wpc="http://schemas.microsoft.com/office/word/2010/wordprocessingCanvas" xmlns:cx="http://schemas.microsoft.com/office/drawing/2014/chartex" xmlns:cx1="http://schemas.microsoft.com/office/drawing/2015/9/8/chartex" xmlns:cx2="http://schemas.microsoft.com/office/drawing/2015/10/21/chartex" xmlns:cx3="http://schemas.microsoft.com/office/drawing/2016/5/9/chartex" xmlns:cx4="http://schemas.microsoft.com/office/drawing/2016/5/10/chartex" xmlns:cx5="http://schemas.microsoft.com/office/drawing/2016/5/11/chartex" xmlns:cx6="http://schemas.microsoft.com/office/drawing/2016/5/12/chartex" xmlns:cx7="http://schemas.microsoft.com/office/drawing/2016/5/13/chartex" xmlns:cx8="http://schemas.microsoft.com/office/drawing/2016/5/14/chartex" xmlns:mc="http://schemas.openxmlformats.org/markup-compatibility/2006" xmlns:aink="http://schemas.microsoft.com/office/drawing/2016/ink" xmlns:am3d="http://schemas.microsoft.com/office/drawing/2017/model3d" xmlns:o="urn:schemas-microsoft-com:office:office" xmlns:oel="http://schemas.microsoft.com/office/2019/extlst" xmlns:r="http://schemas.openxmlformats.org/officeDocument/2006/relationships" xmlns:m="http://schemas.openxmlformats.org/officeDocument/2006/math" xmlns:v="urn:schemas-microsoft-com:vml" xmlns:wp14="http://schemas.microsoft.com/office/word/2010/wordprocessingDrawing" xmlns:wp="http://schemas.openxmlformats.org/drawingml/2006/wordprocessingDrawing" xmlns:w10="urn:schemas-microsoft-com:office:word" xmlns:w="http://schemas.openxmlformats.org/wordprocessingml/2006/main" xmlns:w14="http://schemas.microsoft.com/office/word/2010/wordml" xmlns:w15="http://schemas.microsoft.com/office/word/2012/wordml" xmlns:w16cex="http://schemas.microsoft.com/office/word/2018/wordml/cex" xmlns:w16cid="http://schemas.microsoft.com/office/word/2016/wordml/cid" xmlns:w16="http://schemas.microsoft.com/office/word/2018/wordml" xmlns:w16du="http://schemas.microsoft.com/office/word/2023/wordml/word16du" xmlns:w16sdtdh="http://schemas.microsoft.com/office/word/2020/wordml/sdtdatahash" xmlns:w16sdtfl="http://schemas.microsoft.com/office/word/2024/wordml/sdtformatlock" xmlns:w16se="http://schemas.microsoft.com/office/word/2015/wordml/symex" xmlns:wpg="http://schemas.microsoft.com/office/word/2010/wordprocessingGroup" xmlns:wpi="http://schemas.microsoft.com/office/word/2010/wordprocessingInk" xmlns:wne="http://schemas.microsoft.com/office/word/2006/wordml" xmlns:wps="http://schemas.microsoft.com/office/word/2010/wordprocessingShape" mc:Ignorable="w14 w15 w16se w16cid w16 w16cex w16sdtdh w16sdtfl w16du wp14">
   <w:endnote w:type="separator" w:id="-1">
     <w:p>
       <w:pPr>
@@ -4857,7 +4694,7 @@
 </file>
 
 <file path=word/footer1.xml><?xml version="1.0" encoding="utf-8"?>
-<w:ftr xmlns:wpc="http://schemas.microsoft.com/office/word/2010/wordprocessingCanvas" xmlns:cx="http://schemas.microsoft.com/office/drawing/2014/chartex" xmlns:cx1="http://schemas.microsoft.com/office/drawing/2015/9/8/chartex" xmlns:mc="http://schemas.openxmlformats.org/markup-compatibility/2006" xmlns:o="urn:schemas-microsoft-com:office:office" xmlns:r="http://schemas.openxmlformats.org/officeDocument/2006/relationships" xmlns:m="http://schemas.openxmlformats.org/officeDocument/2006/math" xmlns:v="urn:schemas-microsoft-com:vml" xmlns:wp14="http://schemas.microsoft.com/office/word/2010/wordprocessingDrawing" xmlns:wp="http://schemas.openxmlformats.org/drawingml/2006/wordprocessingDrawing" xmlns:w10="urn:schemas-microsoft-com:office:word" xmlns:w="http://schemas.openxmlformats.org/wordprocessingml/2006/main" xmlns:w14="http://schemas.microsoft.com/office/word/2010/wordml" xmlns:w15="http://schemas.microsoft.com/office/word/2012/wordml" xmlns:w16se="http://schemas.microsoft.com/office/word/2015/wordml/symex" xmlns:wpg="http://schemas.microsoft.com/office/word/2010/wordprocessingGroup" xmlns:wpi="http://schemas.microsoft.com/office/word/2010/wordprocessingInk" xmlns:wne="http://schemas.microsoft.com/office/word/2006/wordml" xmlns:wps="http://schemas.microsoft.com/office/word/2010/wordprocessingShape" mc:Ignorable="w14 w15 w16se wp14">
+<w:ftr xmlns:wpc="http://schemas.microsoft.com/office/word/2010/wordprocessingCanvas" xmlns:cx="http://schemas.microsoft.com/office/drawing/2014/chartex" xmlns:cx1="http://schemas.microsoft.com/office/drawing/2015/9/8/chartex" xmlns:cx2="http://schemas.microsoft.com/office/drawing/2015/10/21/chartex" xmlns:cx3="http://schemas.microsoft.com/office/drawing/2016/5/9/chartex" xmlns:cx4="http://schemas.microsoft.com/office/drawing/2016/5/10/chartex" xmlns:cx5="http://schemas.microsoft.com/office/drawing/2016/5/11/chartex" xmlns:cx6="http://schemas.microsoft.com/office/drawing/2016/5/12/chartex" xmlns:cx7="http://schemas.microsoft.com/office/drawing/2016/5/13/chartex" xmlns:cx8="http://schemas.microsoft.com/office/drawing/2016/5/14/chartex" xmlns:mc="http://schemas.openxmlformats.org/markup-compatibility/2006" xmlns:aink="http://schemas.microsoft.com/office/drawing/2016/ink" xmlns:am3d="http://schemas.microsoft.com/office/drawing/2017/model3d" xmlns:o="urn:schemas-microsoft-com:office:office" xmlns:oel="http://schemas.microsoft.com/office/2019/extlst" xmlns:r="http://schemas.openxmlformats.org/officeDocument/2006/relationships" xmlns:m="http://schemas.openxmlformats.org/officeDocument/2006/math" xmlns:v="urn:schemas-microsoft-com:vml" xmlns:wp14="http://schemas.microsoft.com/office/word/2010/wordprocessingDrawing" xmlns:wp="http://schemas.openxmlformats.org/drawingml/2006/wordprocessingDrawing" xmlns:w10="urn:schemas-microsoft-com:office:word" xmlns:w="http://schemas.openxmlformats.org/wordprocessingml/2006/main" xmlns:w14="http://schemas.microsoft.com/office/word/2010/wordml" xmlns:w15="http://schemas.microsoft.com/office/word/2012/wordml" xmlns:w16cex="http://schemas.microsoft.com/office/word/2018/wordml/cex" xmlns:w16cid="http://schemas.microsoft.com/office/word/2016/wordml/cid" xmlns:w16="http://schemas.microsoft.com/office/word/2018/wordml" xmlns:w16du="http://schemas.microsoft.com/office/word/2023/wordml/word16du" xmlns:w16sdtdh="http://schemas.microsoft.com/office/word/2020/wordml/sdtdatahash" xmlns:w16sdtfl="http://schemas.microsoft.com/office/word/2024/wordml/sdtformatlock" xmlns:w16se="http://schemas.microsoft.com/office/word/2015/wordml/symex" xmlns:wpg="http://schemas.microsoft.com/office/word/2010/wordprocessingGroup" xmlns:wpi="http://schemas.microsoft.com/office/word/2010/wordprocessingInk" xmlns:wne="http://schemas.microsoft.com/office/word/2006/wordml" xmlns:wps="http://schemas.microsoft.com/office/word/2010/wordprocessingShape" mc:Ignorable="w14 w15 w16se w16cid w16 w16cex w16sdtdh w16sdtfl w16du wp14">
   <w:p>
     <w:pPr>
       <w:pStyle w:val="Footer"/>
@@ -4868,7 +4705,7 @@
 </file>
 
 <file path=word/footnotes.xml><?xml version="1.0" encoding="utf-8"?>
-<w:footnotes xmlns:wpc="http://schemas.microsoft.com/office/word/2010/wordprocessingCanvas" xmlns:cx="http://schemas.microsoft.com/office/drawing/2014/chartex" xmlns:cx1="http://schemas.microsoft.com/office/drawing/2015/9/8/chartex" xmlns:mc="http://schemas.openxmlformats.org/markup-compatibility/2006" xmlns:o="urn:schemas-microsoft-com:office:office" xmlns:r="http://schemas.openxmlformats.org/officeDocument/2006/relationships" xmlns:m="http://schemas.openxmlformats.org/officeDocument/2006/math" xmlns:v="urn:schemas-microsoft-com:vml" xmlns:wp14="http://schemas.microsoft.com/office/word/2010/wordprocessingDrawing" xmlns:wp="http://schemas.openxmlformats.org/drawingml/2006/wordprocessingDrawing" xmlns:w10="urn:schemas-microsoft-com:office:word" xmlns:w="http://schemas.openxmlformats.org/wordprocessingml/2006/main" xmlns:w14="http://schemas.microsoft.com/office/word/2010/wordml" xmlns:w15="http://schemas.microsoft.com/office/word/2012/wordml" xmlns:w16se="http://schemas.microsoft.com/office/word/2015/wordml/symex" xmlns:wpg="http://schemas.microsoft.com/office/word/2010/wordprocessingGroup" xmlns:wpi="http://schemas.microsoft.com/office/word/2010/wordprocessingInk" xmlns:wne="http://schemas.microsoft.com/office/word/2006/wordml" xmlns:wps="http://schemas.microsoft.com/office/word/2010/wordprocessingShape" mc:Ignorable="w14 w15 w16se wp14">
+<w:footnotes xmlns:wpc="http://schemas.microsoft.com/office/word/2010/wordprocessingCanvas" xmlns:cx="http://schemas.microsoft.com/office/drawing/2014/chartex" xmlns:cx1="http://schemas.microsoft.com/office/drawing/2015/9/8/chartex" xmlns:cx2="http://schemas.microsoft.com/office/drawing/2015/10/21/chartex" xmlns:cx3="http://schemas.microsoft.com/office/drawing/2016/5/9/chartex" xmlns:cx4="http://schemas.microsoft.com/office/drawing/2016/5/10/chartex" xmlns:cx5="http://schemas.microsoft.com/office/drawing/2016/5/11/chartex" xmlns:cx6="http://schemas.microsoft.com/office/drawing/2016/5/12/chartex" xmlns:cx7="http://schemas.microsoft.com/office/drawing/2016/5/13/chartex" xmlns:cx8="http://schemas.microsoft.com/office/drawing/2016/5/14/chartex" xmlns:mc="http://schemas.openxmlformats.org/markup-compatibility/2006" xmlns:aink="http://schemas.microsoft.com/office/drawing/2016/ink" xmlns:am3d="http://schemas.microsoft.com/office/drawing/2017/model3d" xmlns:o="urn:schemas-microsoft-com:office:office" xmlns:oel="http://schemas.microsoft.com/office/2019/extlst" xmlns:r="http://schemas.openxmlformats.org/officeDocument/2006/relationships" xmlns:m="http://schemas.openxmlformats.org/officeDocument/2006/math" xmlns:v="urn:schemas-microsoft-com:vml" xmlns:wp14="http://schemas.microsoft.com/office/word/2010/wordprocessingDrawing" xmlns:wp="http://schemas.openxmlformats.org/drawingml/2006/wordprocessingDrawing" xmlns:w10="urn:schemas-microsoft-com:office:word" xmlns:w="http://schemas.openxmlformats.org/wordprocessingml/2006/main" xmlns:w14="http://schemas.microsoft.com/office/word/2010/wordml" xmlns:w15="http://schemas.microsoft.com/office/word/2012/wordml" xmlns:w16cex="http://schemas.microsoft.com/office/word/2018/wordml/cex" xmlns:w16cid="http://schemas.microsoft.com/office/word/2016/wordml/cid" xmlns:w16="http://schemas.microsoft.com/office/word/2018/wordml" xmlns:w16du="http://schemas.microsoft.com/office/word/2023/wordml/word16du" xmlns:w16sdtdh="http://schemas.microsoft.com/office/word/2020/wordml/sdtdatahash" xmlns:w16sdtfl="http://schemas.microsoft.com/office/word/2024/wordml/sdtformatlock" xmlns:w16se="http://schemas.microsoft.com/office/word/2015/wordml/symex" xmlns:wpg="http://schemas.microsoft.com/office/word/2010/wordprocessingGroup" xmlns:wpi="http://schemas.microsoft.com/office/word/2010/wordprocessingInk" xmlns:wne="http://schemas.microsoft.com/office/word/2006/wordml" xmlns:wps="http://schemas.microsoft.com/office/word/2010/wordprocessingShape" mc:Ignorable="w14 w15 w16se w16cid w16 w16cex w16sdtdh w16sdtfl w16du wp14">
   <w:footnote w:type="separator" w:id="-1">
     <w:p>
       <w:pPr>
@@ -4893,7 +4730,7 @@
 </file>
 
 <file path=word/numbering.xml><?xml version="1.0" encoding="utf-8"?>
-<w:numbering xmlns:wpc="http://schemas.microsoft.com/office/word/2010/wordprocessingCanvas" xmlns:cx="http://schemas.microsoft.com/office/drawing/2014/chartex" xmlns:cx1="http://schemas.microsoft.com/office/drawing/2015/9/8/chartex" xmlns:mc="http://schemas.openxmlformats.org/markup-compatibility/2006" xmlns:o="urn:schemas-microsoft-com:office:office" xmlns:r="http://schemas.openxmlformats.org/officeDocument/2006/relationships" xmlns:m="http://schemas.openxmlformats.org/officeDocument/2006/math" xmlns:v="urn:schemas-microsoft-com:vml" xmlns:wp14="http://schemas.microsoft.com/office/word/2010/wordprocessingDrawing" xmlns:wp="http://schemas.openxmlformats.org/drawingml/2006/wordprocessingDrawing" xmlns:w10="urn:schemas-microsoft-com:office:word" xmlns:w="http://schemas.openxmlformats.org/wordprocessingml/2006/main" xmlns:w14="http://schemas.microsoft.com/office/word/2010/wordml" xmlns:w15="http://schemas.microsoft.com/office/word/2012/wordml" xmlns:w16se="http://schemas.microsoft.com/office/word/2015/wordml/symex" xmlns:wpg="http://schemas.microsoft.com/office/word/2010/wordprocessingGroup" xmlns:wpi="http://schemas.microsoft.com/office/word/2010/wordprocessingInk" xmlns:wne="http://schemas.microsoft.com/office/word/2006/wordml" xmlns:wps="http://schemas.microsoft.com/office/word/2010/wordprocessingShape" mc:Ignorable="w14 w15 w16se wp14">
+<w:numbering xmlns:wpc="http://schemas.microsoft.com/office/word/2010/wordprocessingCanvas" xmlns:cx="http://schemas.microsoft.com/office/drawing/2014/chartex" xmlns:cx1="http://schemas.microsoft.com/office/drawing/2015/9/8/chartex" xmlns:cx2="http://schemas.microsoft.com/office/drawing/2015/10/21/chartex" xmlns:cx3="http://schemas.microsoft.com/office/drawing/2016/5/9/chartex" xmlns:cx4="http://schemas.microsoft.com/office/drawing/2016/5/10/chartex" xmlns:cx5="http://schemas.microsoft.com/office/drawing/2016/5/11/chartex" xmlns:cx6="http://schemas.microsoft.com/office/drawing/2016/5/12/chartex" xmlns:cx7="http://schemas.microsoft.com/office/drawing/2016/5/13/chartex" xmlns:cx8="http://schemas.microsoft.com/office/drawing/2016/5/14/chartex" xmlns:mc="http://schemas.openxmlformats.org/markup-compatibility/2006" xmlns:aink="http://schemas.microsoft.com/office/drawing/2016/ink" xmlns:am3d="http://schemas.microsoft.com/office/drawing/2017/model3d" xmlns:o="urn:schemas-microsoft-com:office:office" xmlns:oel="http://schemas.microsoft.com/office/2019/extlst" xmlns:r="http://schemas.openxmlformats.org/officeDocument/2006/relationships" xmlns:m="http://schemas.openxmlformats.org/officeDocument/2006/math" xmlns:v="urn:schemas-microsoft-com:vml" xmlns:wp14="http://schemas.microsoft.com/office/word/2010/wordprocessingDrawing" xmlns:wp="http://schemas.openxmlformats.org/drawingml/2006/wordprocessingDrawing" xmlns:w10="urn:schemas-microsoft-com:office:word" xmlns:w="http://schemas.openxmlformats.org/wordprocessingml/2006/main" xmlns:w14="http://schemas.microsoft.com/office/word/2010/wordml" xmlns:w15="http://schemas.microsoft.com/office/word/2012/wordml" xmlns:w16cex="http://schemas.microsoft.com/office/word/2018/wordml/cex" xmlns:w16cid="http://schemas.microsoft.com/office/word/2016/wordml/cid" xmlns:w16="http://schemas.microsoft.com/office/word/2018/wordml" xmlns:w16du="http://schemas.microsoft.com/office/word/2023/wordml/word16du" xmlns:w16sdtdh="http://schemas.microsoft.com/office/word/2020/wordml/sdtdatahash" xmlns:w16sdtfl="http://schemas.microsoft.com/office/word/2024/wordml/sdtformatlock" xmlns:w16se="http://schemas.microsoft.com/office/word/2015/wordml/symex" xmlns:wpg="http://schemas.microsoft.com/office/word/2010/wordprocessingGroup" xmlns:wpi="http://schemas.microsoft.com/office/word/2010/wordprocessingInk" xmlns:wne="http://schemas.microsoft.com/office/word/2006/wordml" xmlns:wps="http://schemas.microsoft.com/office/word/2010/wordprocessingShape" mc:Ignorable="w14 w15 w16se w16cid w16 w16cex w16sdtdh w16sdtfl w16du wp14">
   <w:abstractNum w:abstractNumId="0" w15:restartNumberingAfterBreak="0">
     <w:nsid w:val="FFFFFF7C"/>
     <w:multiLevelType w:val="singleLevel"/>
@@ -5065,38 +4902,38 @@
       </w:rPr>
     </w:lvl>
   </w:abstractNum>
-  <w:num w:numId="1">
+  <w:num w:numId="1" w16cid:durableId="279412517">
     <w:abstractNumId w:val="8"/>
   </w:num>
-  <w:num w:numId="2">
+  <w:num w:numId="2" w16cid:durableId="2113354074">
     <w:abstractNumId w:val="6"/>
   </w:num>
-  <w:num w:numId="3">
+  <w:num w:numId="3" w16cid:durableId="1736925444">
     <w:abstractNumId w:val="5"/>
   </w:num>
-  <w:num w:numId="4">
+  <w:num w:numId="4" w16cid:durableId="1246381482">
     <w:abstractNumId w:val="4"/>
   </w:num>
-  <w:num w:numId="5">
+  <w:num w:numId="5" w16cid:durableId="487089910">
     <w:abstractNumId w:val="7"/>
   </w:num>
-  <w:num w:numId="6">
+  <w:num w:numId="6" w16cid:durableId="1454131371">
     <w:abstractNumId w:val="3"/>
   </w:num>
-  <w:num w:numId="7">
+  <w:num w:numId="7" w16cid:durableId="521212812">
     <w:abstractNumId w:val="2"/>
   </w:num>
-  <w:num w:numId="8">
+  <w:num w:numId="8" w16cid:durableId="679090161">
     <w:abstractNumId w:val="1"/>
   </w:num>
-  <w:num w:numId="9">
+  <w:num w:numId="9" w16cid:durableId="2124878046">
     <w:abstractNumId w:val="0"/>
   </w:num>
 </w:numbering>
 </file>
 
 <file path=word/styles.xml><?xml version="1.0" encoding="utf-8"?>
-<w:styles xmlns:mc="http://schemas.openxmlformats.org/markup-compatibility/2006" xmlns:r="http://schemas.openxmlformats.org/officeDocument/2006/relationships" xmlns:w="http://schemas.openxmlformats.org/wordprocessingml/2006/main" xmlns:w14="http://schemas.microsoft.com/office/word/2010/wordml" xmlns:w15="http://schemas.microsoft.com/office/word/2012/wordml" xmlns:w16se="http://schemas.microsoft.com/office/word/2015/wordml/symex" mc:Ignorable="w14 w15 w16se">
+<w:styles xmlns:mc="http://schemas.openxmlformats.org/markup-compatibility/2006" xmlns:r="http://schemas.openxmlformats.org/officeDocument/2006/relationships" xmlns:w="http://schemas.openxmlformats.org/wordprocessingml/2006/main" xmlns:w14="http://schemas.microsoft.com/office/word/2010/wordml" xmlns:w15="http://schemas.microsoft.com/office/word/2012/wordml" xmlns:w16cex="http://schemas.microsoft.com/office/word/2018/wordml/cex" xmlns:w16cid="http://schemas.microsoft.com/office/word/2016/wordml/cid" xmlns:w16="http://schemas.microsoft.com/office/word/2018/wordml" xmlns:w16du="http://schemas.microsoft.com/office/word/2023/wordml/word16du" xmlns:w16sdtdh="http://schemas.microsoft.com/office/word/2020/wordml/sdtdatahash" xmlns:w16sdtfl="http://schemas.microsoft.com/office/word/2024/wordml/sdtformatlock" xmlns:w16se="http://schemas.microsoft.com/office/word/2015/wordml/symex" mc:Ignorable="w14 w15 w16se w16cid w16 w16cex w16sdtdh w16sdtfl w16du">
   <w:docDefaults>
     <w:rPrDefault>
       <w:rPr>
@@ -5112,7 +4949,7 @@
       </w:pPr>
     </w:pPrDefault>
   </w:docDefaults>
-  <w:latentStyles w:defLockedState="0" w:defUIPriority="99" w:defSemiHidden="0" w:defUnhideWhenUsed="0" w:defQFormat="0" w:count="371">
+  <w:latentStyles w:defLockedState="0" w:defUIPriority="99" w:defSemiHidden="0" w:defUnhideWhenUsed="0" w:defQFormat="0" w:count="376">
     <w:lsdException w:name="Normal" w:uiPriority="0" w:qFormat="1"/>
     <w:lsdException w:name="heading 1" w:uiPriority="9" w:qFormat="1"/>
     <w:lsdException w:name="heading 2" w:semiHidden="1" w:uiPriority="9" w:unhideWhenUsed="1" w:qFormat="1"/>
@@ -5475,6 +5312,11 @@
     <w:lsdException w:name="List Table 5 Dark Accent 6" w:uiPriority="50"/>
     <w:lsdException w:name="List Table 6 Colorful Accent 6" w:uiPriority="51"/>
     <w:lsdException w:name="List Table 7 Colorful Accent 6" w:uiPriority="52"/>
+    <w:lsdException w:name="Mention" w:semiHidden="1" w:unhideWhenUsed="1"/>
+    <w:lsdException w:name="Smart Hyperlink" w:semiHidden="1" w:unhideWhenUsed="1"/>
+    <w:lsdException w:name="Hashtag" w:semiHidden="1" w:unhideWhenUsed="1"/>
+    <w:lsdException w:name="Unresolved Mention" w:semiHidden="1" w:unhideWhenUsed="1"/>
+    <w:lsdException w:name="Smart Link" w:semiHidden="1" w:unhideWhenUsed="1"/>
   </w:latentStyles>
   <w:style w:type="paragraph" w:default="1" w:styleId="Normal">
     <w:name w:val="Normal"/>

</xml_diff>

<commit_message>
add dashboard screenshots in doc file
</commit_message>
<xml_diff>
--- a/docs/LLM_Monitoring_Platform_Technical_Report.docx
+++ b/docs/LLM_Monitoring_Platform_Technical_Report.docx
@@ -4657,8 +4657,94 @@
         <w:t>The platform provides a well-scoped monitoring foundation for a local RAG application. Its strongest features are complete request telemetry, transparent metric calculations, quality and drift evaluation, and an investigation-oriented dashboard. The measured system is reliable and reasonably fast, but the consolidated health score demonstrates that observability is only useful when baselines and alert delivery are trustworthy. Versioned drift baselines, continuous analysis, external notifications and automated tests are the highest-value next steps toward production readiness.</w:t>
       </w:r>
     </w:p>
+    <w:p>
+      <w:pPr>
+        <w:spacing w:after="200" w:line="276" w:lineRule="auto"/>
+      </w:pPr>
+      <w:r>
+        <w:br w:type="page"/>
+      </w:r>
+    </w:p>
+    <w:p>
+      <w:pPr>
+        <w:pStyle w:val="Heading2"/>
+      </w:pPr>
+      <w:r>
+        <w:lastRenderedPageBreak/>
+        <w:t>Outputs</w:t>
+      </w:r>
+    </w:p>
+    <w:p>
+      <w:r>
+        <w:object w:dxaOrig="6121" w:dyaOrig="7920" w14:anchorId="7795DAF4">
+          <v:shapetype id="_x0000_t75" coordsize="21600,21600" o:spt="75" o:preferrelative="t" path="m@4@5l@4@11@9@11@9@5xe" filled="f" stroked="f">
+            <v:stroke joinstyle="miter"/>
+            <v:formulas>
+              <v:f eqn="if lineDrawn pixelLineWidth 0"/>
+              <v:f eqn="sum @0 1 0"/>
+              <v:f eqn="sum 0 0 @1"/>
+              <v:f eqn="prod @2 1 2"/>
+              <v:f eqn="prod @3 21600 pixelWidth"/>
+              <v:f eqn="prod @3 21600 pixelHeight"/>
+              <v:f eqn="sum @0 0 1"/>
+              <v:f eqn="prod @6 1 2"/>
+              <v:f eqn="prod @7 21600 pixelWidth"/>
+              <v:f eqn="sum @8 21600 0"/>
+              <v:f eqn="prod @7 21600 pixelHeight"/>
+              <v:f eqn="sum @10 21600 0"/>
+            </v:formulas>
+            <v:path o:extrusionok="f" gradientshapeok="t" o:connecttype="rect"/>
+            <o:lock v:ext="edit" aspectratio="t"/>
+          </v:shapetype>
+          <v:shape id="_x0000_i1029" type="#_x0000_t75" style="width:306pt;height:396pt" o:ole="">
+            <v:imagedata r:id="rId8" o:title=""/>
+          </v:shape>
+          <o:OLEObject Type="Embed" ProgID="Acrobat.Document.DC" ShapeID="_x0000_i1029" DrawAspect="Content" ObjectID="_1843135461" r:id="rId9"/>
+        </w:object>
+      </w:r>
+      <w:r>
+        <w:object w:dxaOrig="6121" w:dyaOrig="7920" w14:anchorId="4628630B">
+          <v:shape id="_x0000_i1030" type="#_x0000_t75" style="width:306pt;height:396pt" o:ole="">
+            <v:imagedata r:id="rId10" o:title=""/>
+          </v:shape>
+          <o:OLEObject Type="Embed" ProgID="Acrobat.Document.DC" ShapeID="_x0000_i1030" DrawAspect="Content" ObjectID="_1843135462" r:id="rId11"/>
+        </w:object>
+      </w:r>
+      <w:r>
+        <w:object w:dxaOrig="6121" w:dyaOrig="7920" w14:anchorId="5AFF3306">
+          <v:shape id="_x0000_i1031" type="#_x0000_t75" style="width:306pt;height:396pt" o:ole="">
+            <v:imagedata r:id="rId12" o:title=""/>
+          </v:shape>
+          <o:OLEObject Type="Embed" ProgID="Acrobat.Document.DC" ShapeID="_x0000_i1031" DrawAspect="Content" ObjectID="_1843135463" r:id="rId13"/>
+        </w:object>
+      </w:r>
+      <w:r>
+        <w:object w:dxaOrig="6121" w:dyaOrig="7920" w14:anchorId="5D9F2FC1">
+          <v:shape id="_x0000_i1032" type="#_x0000_t75" style="width:306pt;height:396pt" o:ole="">
+            <v:imagedata r:id="rId14" o:title=""/>
+          </v:shape>
+          <o:OLEObject Type="Embed" ProgID="Acrobat.Document.DC" ShapeID="_x0000_i1032" DrawAspect="Content" ObjectID="_1843135464" r:id="rId15"/>
+        </w:object>
+      </w:r>
+      <w:r>
+        <w:object w:dxaOrig="6121" w:dyaOrig="7920" w14:anchorId="56715D52">
+          <v:shape id="_x0000_i1033" type="#_x0000_t75" style="width:306pt;height:396pt" o:ole="">
+            <v:imagedata r:id="rId16" o:title=""/>
+          </v:shape>
+          <o:OLEObject Type="Embed" ProgID="Acrobat.Document.DC" ShapeID="_x0000_i1033" DrawAspect="Content" ObjectID="_1843135465" r:id="rId17"/>
+        </w:object>
+      </w:r>
+      <w:r>
+        <w:object w:dxaOrig="6121" w:dyaOrig="7920" w14:anchorId="1312D848">
+          <v:shape id="_x0000_i1034" type="#_x0000_t75" style="width:306pt;height:396pt" o:ole="">
+            <v:imagedata r:id="rId18" o:title=""/>
+          </v:shape>
+          <o:OLEObject Type="Embed" ProgID="Acrobat.Document.DC" ShapeID="_x0000_i1034" DrawAspect="Content" ObjectID="_1843135466" r:id="rId19"/>
+        </w:object>
+      </w:r>
+    </w:p>
     <w:sectPr>
-      <w:footerReference w:type="default" r:id="rId8"/>
+      <w:footerReference w:type="default" r:id="rId20"/>
       <w:pgSz w:w="12240" w:h="15840"/>
       <w:pgMar w:top="979" w:right="1123" w:bottom="893" w:left="1123" w:header="461" w:footer="461" w:gutter="0"/>
       <w:cols w:space="720"/>

</xml_diff>